<commit_message>
docs: update practical reports title pages
</commit_message>
<xml_diff>
--- a/Отчёты/Практическая работа №5.docx
+++ b/Отчёты/Практическая работа №5.docx
@@ -2,74 +2,1482 @@
 <file path=word/document.xml><?xml version="1.0" encoding="utf-8"?>
 <w:document xmlns:wpc="http://schemas.microsoft.com/office/word/2010/wordprocessingCanvas" xmlns:mo="http://schemas.microsoft.com/office/mac/office/2008/main" xmlns:mc="http://schemas.openxmlformats.org/markup-compatibility/2006" xmlns:mv="urn:schemas-microsoft-com:mac:vml" xmlns:o="urn:schemas-microsoft-com:office:office" xmlns:r="http://schemas.openxmlformats.org/officeDocument/2006/relationships" xmlns:m="http://schemas.openxmlformats.org/officeDocument/2006/math" xmlns:v="urn:schemas-microsoft-com:vml" xmlns:wp14="http://schemas.microsoft.com/office/word/2010/wordprocessingDrawing" xmlns:wp="http://schemas.openxmlformats.org/drawingml/2006/wordprocessingDrawing" xmlns:w10="urn:schemas-microsoft-com:office:word" xmlns:w="http://schemas.openxmlformats.org/wordprocessingml/2006/main" xmlns:w14="http://schemas.microsoft.com/office/word/2010/wordml" xmlns:wpg="http://schemas.microsoft.com/office/word/2010/wordprocessingGroup" xmlns:wpi="http://schemas.microsoft.com/office/word/2010/wordprocessingInk" xmlns:wne="http://schemas.microsoft.com/office/word/2006/wordml" xmlns:wps="http://schemas.microsoft.com/office/word/2010/wordprocessingShape" mc:Ignorable="w14 wp14">
   <w:body>
+    <w:tbl>
+      <w:tblPr>
+        <w:tblW w:w="5000" w:type="pct"/>
+        <w:tblCellMar>
+          <w:left w:w="0" w:type="dxa"/>
+          <w:right w:w="0" w:type="dxa"/>
+        </w:tblCellMar>
+        <w:tblLook w:val="0000" w:firstRow="0" w:lastRow="0" w:firstColumn="0" w:lastColumn="0" w:noHBand="0" w:noVBand="0"/>
+      </w:tblPr>
+      <w:tblGrid>
+        <w:gridCol w:w="9355"/>
+      </w:tblGrid>
+      <w:tr>
+        <w:trPr>
+          <w:cantSplit/>
+          <w:trHeight w:val="180"/>
+        </w:trPr>
+        <w:tc>
+          <w:tcPr>
+            <w:tcW w:w="5000" w:type="pct"/>
+          </w:tcPr>
+          <w:p>
+            <w:pPr>
+              <w:spacing w:before="60" w:after="0"/>
+              <w:jc w:val="center"/>
+              <w:rPr>
+                <w:rFonts w:ascii="Times New Roman" w:eastAsia="Calibri" w:hAnsi="Times New Roman" w:cs="Times New Roman"/>
+                <w:caps/>
+              </w:rPr>
+            </w:pPr>
+            <w:r>
+              <w:rPr>
+                <w:rFonts w:ascii="Times New Roman" w:eastAsia="Calibri" w:hAnsi="Times New Roman" w:cs="Times New Roman"/>
+                <w:caps/>
+                <w:noProof/>
+                <w:lang w:eastAsia="ru-RU"/>
+              </w:rPr>
+              <w:drawing>
+                <wp:inline distT="0" distB="0" distL="0" distR="0" wp14:anchorId="38FA7132" wp14:editId="7AD55D5B">
+                  <wp:extent cx="992038" cy="1124059"/>
+                  <wp:effectExtent l="19050" t="0" r="0" b="0"/>
+                  <wp:docPr id="629074536" name="Рисунок 2" descr="A black and white emblem with two birds and a crown&#10;&#10;AI-generated content may be incorrect."/>
+                  <wp:cNvGraphicFramePr>
+                    <a:graphicFrameLocks xmlns:a="http://schemas.openxmlformats.org/drawingml/2006/main" noChangeAspect="1"/>
+                  </wp:cNvGraphicFramePr>
+                  <a:graphic xmlns:a="http://schemas.openxmlformats.org/drawingml/2006/main">
+                    <a:graphicData uri="http://schemas.openxmlformats.org/drawingml/2006/picture">
+                      <pic:pic xmlns:pic="http://schemas.openxmlformats.org/drawingml/2006/picture">
+                        <pic:nvPicPr>
+                          <pic:cNvPr id="629074536" name="Рисунок 2" descr="A black and white emblem with two birds and a crown&#10;&#10;AI-generated content may be incorrect."/>
+                          <pic:cNvPicPr>
+                            <a:picLocks noChangeAspect="1"/>
+                          </pic:cNvPicPr>
+                        </pic:nvPicPr>
+                        <pic:blipFill>
+                          <a:blip r:embed="rId6"/>
+                          <a:stretch/>
+                        </pic:blipFill>
+                        <pic:spPr bwMode="auto">
+                          <a:xfrm>
+                            <a:off x="0" y="0"/>
+                            <a:ext cx="992600" cy="1124695"/>
+                          </a:xfrm>
+                          <a:prstGeom prst="rect">
+                            <a:avLst/>
+                          </a:prstGeom>
+                        </pic:spPr>
+                      </pic:pic>
+                    </a:graphicData>
+                  </a:graphic>
+                </wp:inline>
+              </w:drawing>
+            </w:r>
+          </w:p>
+          <w:p>
+            <w:pPr>
+              <w:spacing w:before="60" w:after="0"/>
+              <w:jc w:val="center"/>
+              <w:rPr>
+                <w:rFonts w:ascii="Times New Roman" w:eastAsia="Calibri" w:hAnsi="Times New Roman" w:cs="Times New Roman"/>
+                <w:caps/>
+              </w:rPr>
+            </w:pPr>
+            <w:r>
+              <w:rPr>
+                <w:rFonts w:ascii="Times New Roman" w:eastAsia="Calibri" w:hAnsi="Times New Roman" w:cs="Times New Roman"/>
+                <w:caps/>
+              </w:rPr>
+              <w:t>МИНОБРНАУКИ РОССИИ</w:t>
+            </w:r>
+          </w:p>
+        </w:tc>
+      </w:tr>
+      <w:tr>
+        <w:trPr>
+          <w:cantSplit/>
+          <w:trHeight w:val="1417"/>
+        </w:trPr>
+        <w:tc>
+          <w:tcPr>
+            <w:tcW w:w="5000" w:type="pct"/>
+          </w:tcPr>
+          <w:p>
+            <w:pPr>
+              <w:widowControl w:val="0"/>
+              <w:spacing w:after="0" w:line="216" w:lineRule="auto"/>
+              <w:jc w:val="center"/>
+              <w:rPr>
+                <w:rFonts w:ascii="Times New Roman" w:eastAsia="Times New Roman" w:hAnsi="Times New Roman" w:cs="Times New Roman"/>
+                <w:b/>
+                <w:iCs/>
+                <w:sz w:val="20"/>
+                <w:szCs w:val="24"/>
+                <w:lang w:eastAsia="ru-RU"/>
+              </w:rPr>
+            </w:pPr>
+            <w:r>
+              <w:rPr>
+                <w:rFonts w:ascii="Times New Roman" w:eastAsia="Times New Roman" w:hAnsi="Times New Roman" w:cs="Times New Roman"/>
+                <w:iCs/>
+                <w:sz w:val="24"/>
+                <w:szCs w:val="24"/>
+                <w:lang w:eastAsia="ru-RU"/>
+              </w:rPr>
+              <w:t>Федеральное государственное бюджетное образовательное учреждение</w:t>
+            </w:r>
+            <w:r>
+              <w:rPr>
+                <w:rFonts w:ascii="Times New Roman" w:eastAsia="Times New Roman" w:hAnsi="Times New Roman" w:cs="Times New Roman"/>
+                <w:iCs/>
+                <w:sz w:val="24"/>
+                <w:szCs w:val="24"/>
+                <w:lang w:eastAsia="ru-RU"/>
+              </w:rPr>
+              <w:br/>
+              <w:t>высшего образования</w:t>
+            </w:r>
+            <w:r>
+              <w:rPr>
+                <w:rFonts w:ascii="Times New Roman" w:eastAsia="Times New Roman" w:hAnsi="Times New Roman" w:cs="Times New Roman"/>
+                <w:iCs/>
+                <w:sz w:val="24"/>
+                <w:szCs w:val="24"/>
+                <w:lang w:eastAsia="ru-RU"/>
+              </w:rPr>
+              <w:br/>
+            </w:r>
+            <w:r>
+              <w:rPr>
+                <w:rFonts w:ascii="Times New Roman CYR" w:eastAsia="Times New Roman" w:hAnsi="Times New Roman CYR" w:cs="Times New Roman CYR"/>
+                <w:b/>
+                <w:bCs/>
+                <w:iCs/>
+                <w:sz w:val="24"/>
+                <w:szCs w:val="24"/>
+                <w:lang w:eastAsia="ru-RU"/>
+              </w:rPr>
+              <w:t xml:space="preserve">«МИРЭА </w:t>
+            </w:r>
+            <w:r>
+              <w:rPr>
+                <w:rFonts w:ascii="Symbol" w:eastAsia="Symbol" w:hAnsi="Symbol" w:cs="Symbol"/>
+                <w:b/>
+                <w:bCs/>
+                <w:iCs/>
+                <w:sz w:val="24"/>
+                <w:szCs w:val="24"/>
+                <w:lang w:eastAsia="ru-RU"/>
+              </w:rPr>
+              <w:t></w:t>
+            </w:r>
+            <w:r>
+              <w:rPr>
+                <w:rFonts w:ascii="Times New Roman CYR" w:eastAsia="Times New Roman" w:hAnsi="Times New Roman CYR" w:cs="Times New Roman CYR"/>
+                <w:b/>
+                <w:bCs/>
+                <w:iCs/>
+                <w:sz w:val="24"/>
+                <w:szCs w:val="24"/>
+                <w:lang w:eastAsia="ru-RU"/>
+              </w:rPr>
+              <w:t xml:space="preserve"> Российский технологический университет»</w:t>
+            </w:r>
+          </w:p>
+          <w:p>
+            <w:pPr>
+              <w:spacing w:after="0"/>
+              <w:jc w:val="center"/>
+              <w:rPr>
+                <w:rFonts w:ascii="Times New Roman" w:eastAsia="Calibri" w:hAnsi="Times New Roman" w:cs="Times New Roman"/>
+              </w:rPr>
+            </w:pPr>
+            <w:r>
+              <w:rPr>
+                <w:rFonts w:ascii="Times New Roman" w:eastAsia="Calibri" w:hAnsi="Times New Roman" w:cs="Times New Roman"/>
+                <w:b/>
+                <w:sz w:val="32"/>
+                <w:szCs w:val="32"/>
+              </w:rPr>
+              <w:t xml:space="preserve"> РТУ МИРЭА </w:t>
+            </w:r>
+            <w:r>
+              <w:rPr>
+                <w:rFonts w:ascii="Times New Roman" w:eastAsia="Calibri" w:hAnsi="Times New Roman" w:cs="Times New Roman"/>
+                <w:b/>
+                <w:noProof/>
+                <w:sz w:val="32"/>
+                <w:szCs w:val="32"/>
+                <w:lang w:eastAsia="ru-RU"/>
+              </w:rPr>
+              <mc:AlternateContent>
+                <mc:Choice Requires="wps">
+                  <w:drawing>
+                    <wp:inline distT="0" distB="0" distL="0" distR="0" wp14:anchorId="666B7639" wp14:editId="43A366D0">
+                      <wp:extent cx="5600700" cy="1270"/>
+                      <wp:effectExtent l="20955" t="22860" r="26670" b="23495"/>
+                      <wp:docPr id="1468553568" name="Прямая соединительная линия 1"/>
+                      <wp:cNvGraphicFramePr/>
+                      <a:graphic xmlns:a="http://schemas.openxmlformats.org/drawingml/2006/main">
+                        <a:graphicData uri="http://schemas.microsoft.com/office/word/2010/wordprocessingShape">
+                          <wps:wsp>
+                            <wps:cNvCnPr/>
+                            <wps:spPr bwMode="auto">
+                              <a:xfrm flipV="1">
+                                <a:off x="0" y="0"/>
+                                <a:ext cx="5600700" cy="1270"/>
+                              </a:xfrm>
+                              <a:prstGeom prst="line">
+                                <a:avLst/>
+                              </a:prstGeom>
+                              <a:noFill/>
+                              <a:ln w="38100" cmpd="dbl">
+                                <a:solidFill>
+                                  <a:srgbClr val="000000"/>
+                                </a:solidFill>
+                                <a:round/>
+                                <a:headEnd/>
+                                <a:tailEnd/>
+                              </a:ln>
+                            </wps:spPr>
+                            <wps:bodyPr/>
+                          </wps:wsp>
+                        </a:graphicData>
+                      </a:graphic>
+                    </wp:inline>
+                  </w:drawing>
+                </mc:Choice>
+                <mc:Fallback>
+                  <w:pict>
+                    <v:line w14:anchorId="56F25363" id="Прямая соединительная линия 1" o:spid="_x0000_s1026" style="flip:y;visibility:visible;mso-wrap-style:square;mso-left-percent:-10001;mso-top-percent:-10001;mso-position-horizontal:absolute;mso-position-horizontal-relative:char;mso-position-vertical:absolute;mso-position-vertical-relative:line;mso-left-percent:-10001;mso-top-percent:-10001" from="0,0" to="441pt,.1pt" o:gfxdata="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" strokeweight="3pt">
+                      <v:stroke linestyle="thinThin"/>
+                      <w10:anchorlock/>
+                    </v:line>
+                  </w:pict>
+                </mc:Fallback>
+              </mc:AlternateContent>
+            </w:r>
+          </w:p>
+        </w:tc>
+      </w:tr>
+    </w:tbl>
     <w:p>
       <w:pPr>
+        <w:spacing w:after="0"/>
         <w:jc w:val="center"/>
+        <w:rPr>
+          <w:rFonts w:ascii="Times New Roman" w:eastAsia="Calibri" w:hAnsi="Times New Roman" w:cs="Times New Roman"/>
+          <w:b/>
+          <w:bCs/>
+        </w:rPr>
+      </w:pPr>
+    </w:p>
+    <w:p>
+      <w:pPr>
+        <w:spacing w:after="0"/>
+        <w:jc w:val="center"/>
+        <w:rPr>
+          <w:rFonts w:ascii="Times New Roman" w:eastAsia="Calibri" w:hAnsi="Times New Roman" w:cs="Times New Roman"/>
+          <w:b/>
+          <w:bCs/>
+        </w:rPr>
+      </w:pPr>
+    </w:p>
+    <w:p>
+      <w:pPr>
+        <w:spacing w:after="0"/>
+        <w:jc w:val="center"/>
+        <w:rPr>
+          <w:rFonts w:ascii="Times New Roman" w:eastAsia="Calibri" w:hAnsi="Times New Roman" w:cs="Times New Roman"/>
+          <w:b/>
+          <w:bCs/>
+        </w:rPr>
+      </w:pPr>
+    </w:p>
+    <w:p>
+      <w:pPr>
+        <w:spacing w:after="0"/>
+        <w:jc w:val="center"/>
+        <w:rPr>
+          <w:rFonts w:ascii="Times New Roman" w:eastAsia="Calibri" w:hAnsi="Times New Roman" w:cs="Times New Roman"/>
+          <w:b/>
+          <w:bCs/>
+        </w:rPr>
+      </w:pPr>
+    </w:p>
+    <w:p>
+      <w:pPr>
+        <w:spacing w:after="0"/>
+        <w:rPr>
+          <w:rFonts w:ascii="Times New Roman" w:eastAsia="Calibri" w:hAnsi="Times New Roman" w:cs="Times New Roman"/>
+          <w:b/>
+          <w:bCs/>
+        </w:rPr>
+      </w:pPr>
+    </w:p>
+    <w:p>
+      <w:pPr>
+        <w:spacing w:after="0"/>
+        <w:rPr>
+          <w:rFonts w:ascii="Times New Roman" w:eastAsia="Calibri" w:hAnsi="Times New Roman" w:cs="Times New Roman"/>
+          <w:b/>
+        </w:rPr>
+      </w:pPr>
+    </w:p>
+    <w:p>
+      <w:pPr>
+        <w:spacing w:after="0"/>
+        <w:jc w:val="center"/>
+        <w:rPr>
+          <w:rFonts w:ascii="Times New Roman" w:eastAsia="Calibri" w:hAnsi="Times New Roman" w:cs="Times New Roman"/>
+          <w:b/>
+          <w:sz w:val="32"/>
+          <w:szCs w:val="32"/>
+        </w:rPr>
       </w:pPr>
       <w:r>
-        <w:t>МИРЭА — Российский технологический университет</w:t>
-      </w:r>
-    </w:p>
-    <w:p/>
-    <w:p/>
-    <w:p/>
-    <w:p/>
-    <w:p>
-      <w:pPr>
-        <w:pStyle w:val="Title"/>
-        <w:jc w:val="center"/>
-      </w:pPr>
-      <w:r>
-        <w:t>Практическая работа №5</w:t>
+        <w:t>Практическое занятие № 5</w:t>
       </w:r>
     </w:p>
     <w:p>
       <w:pPr>
+        <w:spacing w:after="0"/>
         <w:jc w:val="center"/>
+        <w:rPr>
+          <w:rFonts w:ascii="Times New Roman" w:eastAsia="Calibri" w:hAnsi="Times New Roman" w:cs="Times New Roman"/>
+          <w:b/>
+          <w:sz w:val="32"/>
+          <w:szCs w:val="32"/>
+        </w:rPr>
       </w:pPr>
       <w:r>
         <w:rPr>
-          <w:b/>
+          <w:rFonts w:ascii="Times New Roman" w:eastAsia="Calibri" w:hAnsi="Times New Roman" w:cs="Times New Roman"/>
+          <w:sz w:val="32"/>
         </w:rPr>
-        <w:t>Развёртывание и защита сервера Ubuntu</w:t>
+        <w:t>по дисциплине «</w:t>
+      </w:r>
+      <w:r>
+        <w:rPr>
+          <w:rFonts w:ascii="Times New Roman" w:eastAsia="Calibri" w:hAnsi="Times New Roman" w:cs="Times New Roman"/>
+          <w:sz w:val="32"/>
+        </w:rPr>
+        <w:t xml:space="preserve">Инструменты </w:t>
+      </w:r>
+      <w:proofErr w:type="spellStart"/>
+      <w:r>
+        <w:rPr>
+          <w:rFonts w:ascii="Times New Roman" w:eastAsia="Calibri" w:hAnsi="Times New Roman" w:cs="Times New Roman"/>
+          <w:sz w:val="32"/>
+        </w:rPr>
+        <w:t>девопс</w:t>
+      </w:r>
+      <w:proofErr w:type="spellEnd"/>
+      <w:r>
+        <w:rPr>
+          <w:rFonts w:ascii="Times New Roman" w:eastAsia="Calibri" w:hAnsi="Times New Roman" w:cs="Times New Roman"/>
+          <w:sz w:val="32"/>
+        </w:rPr>
+        <w:t>»</w:t>
       </w:r>
     </w:p>
     <w:p>
       <w:pPr>
+        <w:spacing w:after="0" w:line="360" w:lineRule="auto"/>
         <w:jc w:val="center"/>
+        <w:rPr>
+          <w:rFonts w:ascii="Times New Roman" w:eastAsia="Calibri" w:hAnsi="Times New Roman" w:cs="Times New Roman"/>
+          <w:sz w:val="28"/>
+          <w:szCs w:val="28"/>
+        </w:rPr>
+      </w:pPr>
+    </w:p>
+    <w:p>
+      <w:pPr>
+        <w:tabs>
+          <w:tab w:val="left" w:pos="9355"/>
+        </w:tabs>
+        <w:spacing w:after="0" w:line="360" w:lineRule="auto"/>
+        <w:rPr>
+          <w:rFonts w:ascii="Times New Roman" w:eastAsia="Calibri" w:hAnsi="Times New Roman" w:cs="Times New Roman"/>
+          <w:b/>
+          <w:bCs/>
+          <w:sz w:val="28"/>
+          <w:szCs w:val="28"/>
+        </w:rPr>
       </w:pPr>
       <w:r>
-        <w:t>Дисциплина «Инструменты DevOps»</w:t>
+        <w:t>Тема работы: Развёртывание и защита сервера Ubuntu</w:t>
       </w:r>
     </w:p>
-    <w:p/>
-    <w:p/>
-    <w:p/>
     <w:p>
       <w:pPr>
-        <w:jc w:val="right"/>
+        <w:spacing w:after="0" w:line="360" w:lineRule="auto"/>
+        <w:rPr>
+          <w:rFonts w:ascii="Times New Roman" w:eastAsia="Calibri" w:hAnsi="Times New Roman" w:cs="Times New Roman"/>
+          <w:sz w:val="28"/>
+          <w:szCs w:val="28"/>
+        </w:rPr>
+      </w:pPr>
+    </w:p>
+    <w:p>
+      <w:pPr>
+        <w:spacing w:after="0" w:line="360" w:lineRule="auto"/>
+        <w:rPr>
+          <w:rFonts w:ascii="Times New Roman" w:eastAsia="Calibri" w:hAnsi="Times New Roman" w:cs="Times New Roman"/>
+          <w:sz w:val="28"/>
+          <w:szCs w:val="28"/>
+        </w:rPr>
+      </w:pPr>
+    </w:p>
+    <w:tbl>
+      <w:tblPr>
+        <w:tblW w:w="5000" w:type="pct"/>
+        <w:tblLook w:val="01E0" w:firstRow="1" w:lastRow="1" w:firstColumn="1" w:lastColumn="1" w:noHBand="0" w:noVBand="0"/>
+      </w:tblPr>
+      <w:tblGrid>
+        <w:gridCol w:w="1537"/>
+        <w:gridCol w:w="238"/>
+        <w:gridCol w:w="2344"/>
+        <w:gridCol w:w="283"/>
+        <w:gridCol w:w="1697"/>
+        <w:gridCol w:w="281"/>
+        <w:gridCol w:w="2975"/>
+      </w:tblGrid>
+      <w:tr>
+        <w:trPr>
+          <w:trHeight w:val="51"/>
+        </w:trPr>
+        <w:tc>
+          <w:tcPr>
+            <w:tcW w:w="822" w:type="pct"/>
+            <w:vAlign w:val="bottom"/>
+          </w:tcPr>
+          <w:p>
+            <w:pPr>
+              <w:spacing w:after="0" w:line="276" w:lineRule="auto"/>
+              <w:rPr>
+                <w:rFonts w:ascii="Times New Roman" w:eastAsia="Calibri" w:hAnsi="Times New Roman" w:cs="Times New Roman"/>
+                <w:kern w:val="2"/>
+                <w:sz w:val="20"/>
+                <w:szCs w:val="20"/>
+                <w14:ligatures w14:val="standardContextual"/>
+              </w:rPr>
+            </w:pPr>
+          </w:p>
+        </w:tc>
+        <w:tc>
+          <w:tcPr>
+            <w:tcW w:w="4178" w:type="pct"/>
+            <w:gridSpan w:val="6"/>
+          </w:tcPr>
+          <w:p>
+            <w:pPr>
+              <w:spacing w:after="0" w:line="276" w:lineRule="auto"/>
+              <w:jc w:val="center"/>
+              <w:rPr>
+                <w:rFonts w:ascii="Times New Roman" w:eastAsia="Calibri" w:hAnsi="Times New Roman" w:cs="Times New Roman"/>
+                <w:i/>
+                <w:kern w:val="2"/>
+                <w:sz w:val="18"/>
+                <w:szCs w:val="18"/>
+                <w14:ligatures w14:val="standardContextual"/>
+              </w:rPr>
+            </w:pPr>
+          </w:p>
+        </w:tc>
+      </w:tr>
+      <w:tr>
+        <w:tc>
+          <w:tcPr>
+            <w:tcW w:w="822" w:type="pct"/>
+            <w:vAlign w:val="bottom"/>
+            <w:hideMark/>
+          </w:tcPr>
+          <w:p>
+            <w:pPr>
+              <w:spacing w:after="0" w:line="276" w:lineRule="auto"/>
+              <w:rPr>
+                <w:rFonts w:ascii="Times New Roman" w:eastAsia="Calibri" w:hAnsi="Times New Roman" w:cs="Times New Roman"/>
+                <w:kern w:val="2"/>
+                <w:sz w:val="28"/>
+                <w:szCs w:val="20"/>
+                <w14:ligatures w14:val="standardContextual"/>
+              </w:rPr>
+            </w:pPr>
+            <w:r>
+              <w:rPr>
+                <w:rFonts w:ascii="Times New Roman" w:eastAsia="Calibri" w:hAnsi="Times New Roman" w:cs="Times New Roman"/>
+                <w:kern w:val="2"/>
+                <w:sz w:val="28"/>
+                <w14:ligatures w14:val="standardContextual"/>
+              </w:rPr>
+              <w:t>Выполнил:</w:t>
+            </w:r>
+          </w:p>
+        </w:tc>
+        <w:tc>
+          <w:tcPr>
+            <w:tcW w:w="127" w:type="pct"/>
+            <w:vAlign w:val="bottom"/>
+          </w:tcPr>
+          <w:p>
+            <w:pPr>
+              <w:spacing w:after="0" w:line="276" w:lineRule="auto"/>
+              <w:jc w:val="center"/>
+              <w:rPr>
+                <w:rFonts w:ascii="Times New Roman" w:eastAsia="Calibri" w:hAnsi="Times New Roman" w:cs="Times New Roman"/>
+                <w:kern w:val="2"/>
+                <w:sz w:val="28"/>
+                <w14:ligatures w14:val="standardContextual"/>
+              </w:rPr>
+            </w:pPr>
+          </w:p>
+        </w:tc>
+        <w:tc>
+          <w:tcPr>
+            <w:tcW w:w="1253" w:type="pct"/>
+            <w:vAlign w:val="bottom"/>
+            <w:hideMark/>
+          </w:tcPr>
+          <w:p>
+            <w:pPr>
+              <w:spacing w:after="0" w:line="276" w:lineRule="auto"/>
+              <w:jc w:val="center"/>
+              <w:rPr>
+                <w:rFonts w:ascii="Times New Roman" w:eastAsia="Calibri" w:hAnsi="Times New Roman" w:cs="Times New Roman"/>
+                <w:kern w:val="2"/>
+                <w:sz w:val="28"/>
+                <w14:ligatures w14:val="standardContextual"/>
+              </w:rPr>
+            </w:pPr>
+            <w:r>
+              <w:rPr>
+                <w:rFonts w:ascii="Times New Roman" w:eastAsia="Calibri" w:hAnsi="Times New Roman" w:cs="Times New Roman"/>
+                <w:kern w:val="2"/>
+                <w:sz w:val="28"/>
+                <w14:ligatures w14:val="standardContextual"/>
+              </w:rPr>
+              <w:t>студент группы</w:t>
+            </w:r>
+          </w:p>
+          <w:p>
+            <w:pPr>
+              <w:spacing w:after="0" w:line="276" w:lineRule="auto"/>
+              <w:jc w:val="center"/>
+              <w:rPr>
+                <w:rFonts w:ascii="Times New Roman" w:eastAsia="Calibri" w:hAnsi="Times New Roman" w:cs="Times New Roman"/>
+                <w:kern w:val="2"/>
+                <w:sz w:val="28"/>
+                <w14:ligatures w14:val="standardContextual"/>
+              </w:rPr>
+            </w:pPr>
+          </w:p>
+        </w:tc>
+        <w:tc>
+          <w:tcPr>
+            <w:tcW w:w="151" w:type="pct"/>
+            <w:vAlign w:val="bottom"/>
+          </w:tcPr>
+          <w:p>
+            <w:pPr>
+              <w:spacing w:after="0" w:line="276" w:lineRule="auto"/>
+              <w:jc w:val="center"/>
+              <w:rPr>
+                <w:rFonts w:ascii="Times New Roman" w:eastAsia="Calibri" w:hAnsi="Times New Roman" w:cs="Times New Roman"/>
+                <w:kern w:val="2"/>
+                <w:sz w:val="28"/>
+                <w14:ligatures w14:val="standardContextual"/>
+              </w:rPr>
+            </w:pPr>
+          </w:p>
+        </w:tc>
+        <w:tc>
+          <w:tcPr>
+            <w:tcW w:w="907" w:type="pct"/>
+            <w:vAlign w:val="bottom"/>
+          </w:tcPr>
+          <w:p>
+            <w:pPr>
+              <w:spacing w:after="0" w:line="276" w:lineRule="auto"/>
+              <w:jc w:val="center"/>
+              <w:rPr>
+                <w:rFonts w:ascii="Times New Roman" w:eastAsia="Calibri" w:hAnsi="Times New Roman" w:cs="Times New Roman"/>
+                <w:kern w:val="2"/>
+                <w:sz w:val="28"/>
+                <w14:ligatures w14:val="standardContextual"/>
+              </w:rPr>
+            </w:pPr>
+          </w:p>
+        </w:tc>
+        <w:tc>
+          <w:tcPr>
+            <w:tcW w:w="150" w:type="pct"/>
+            <w:vAlign w:val="bottom"/>
+          </w:tcPr>
+          <w:p>
+            <w:pPr>
+              <w:spacing w:after="0" w:line="276" w:lineRule="auto"/>
+              <w:jc w:val="center"/>
+              <w:rPr>
+                <w:rFonts w:ascii="Times New Roman" w:eastAsia="Calibri" w:hAnsi="Times New Roman" w:cs="Times New Roman"/>
+                <w:kern w:val="2"/>
+                <w:sz w:val="28"/>
+                <w14:ligatures w14:val="standardContextual"/>
+              </w:rPr>
+            </w:pPr>
+          </w:p>
+        </w:tc>
+        <w:tc>
+          <w:tcPr>
+            <w:tcW w:w="1590" w:type="pct"/>
+            <w:vAlign w:val="bottom"/>
+            <w:hideMark/>
+          </w:tcPr>
+          <w:p>
+            <w:pPr>
+              <w:spacing w:after="0" w:line="276" w:lineRule="auto"/>
+              <w:jc w:val="center"/>
+              <w:rPr>
+                <w:rFonts w:ascii="Times New Roman" w:eastAsia="Calibri" w:hAnsi="Times New Roman" w:cs="Times New Roman"/>
+                <w:kern w:val="2"/>
+                <w:sz w:val="28"/>
+                <w14:ligatures w14:val="standardContextual"/>
+              </w:rPr>
+            </w:pPr>
+          </w:p>
+        </w:tc>
+      </w:tr>
+      <w:tr>
+        <w:tc>
+          <w:tcPr>
+            <w:tcW w:w="822" w:type="pct"/>
+          </w:tcPr>
+          <w:p>
+            <w:pPr>
+              <w:spacing w:after="0" w:line="276" w:lineRule="auto"/>
+              <w:rPr>
+                <w:rFonts w:ascii="Times New Roman" w:eastAsia="Calibri" w:hAnsi="Times New Roman" w:cs="Times New Roman"/>
+                <w:kern w:val="2"/>
+                <w:sz w:val="20"/>
+                <w:szCs w:val="20"/>
+                <w14:ligatures w14:val="standardContextual"/>
+              </w:rPr>
+            </w:pPr>
+          </w:p>
+        </w:tc>
+        <w:tc>
+          <w:tcPr>
+            <w:tcW w:w="127" w:type="pct"/>
+          </w:tcPr>
+          <w:p>
+            <w:pPr>
+              <w:spacing w:after="0" w:line="276" w:lineRule="auto"/>
+              <w:jc w:val="center"/>
+              <w:rPr>
+                <w:rFonts w:ascii="Times New Roman" w:eastAsia="Calibri" w:hAnsi="Times New Roman" w:cs="Times New Roman"/>
+                <w:i/>
+                <w:kern w:val="2"/>
+                <w:sz w:val="18"/>
+                <w:szCs w:val="18"/>
+                <w14:ligatures w14:val="standardContextual"/>
+              </w:rPr>
+            </w:pPr>
+          </w:p>
+        </w:tc>
+        <w:tc>
+          <w:tcPr>
+            <w:tcW w:w="1253" w:type="pct"/>
+            <w:hideMark/>
+          </w:tcPr>
+          <w:p>
+            <w:r>
+              <w:rPr>
+                <w:rFonts w:ascii="Times New Roman" w:hAnsi="Times New Roman"/>
+              </w:rPr>
+              <w:t>ЭФБО-03-24</w:t>
+            </w:r>
+          </w:p>
+        </w:tc>
+        <w:tc>
+          <w:tcPr>
+            <w:tcW w:w="151" w:type="pct"/>
+          </w:tcPr>
+          <w:p>
+            <w:pPr>
+              <w:spacing w:after="0" w:line="276" w:lineRule="auto"/>
+              <w:jc w:val="center"/>
+              <w:rPr>
+                <w:rFonts w:ascii="Times New Roman" w:eastAsia="Calibri" w:hAnsi="Times New Roman" w:cs="Times New Roman"/>
+                <w:i/>
+                <w:kern w:val="2"/>
+                <w:sz w:val="18"/>
+                <w:szCs w:val="18"/>
+                <w14:ligatures w14:val="standardContextual"/>
+              </w:rPr>
+            </w:pPr>
+          </w:p>
+        </w:tc>
+        <w:tc>
+          <w:tcPr>
+            <w:tcW w:w="907" w:type="pct"/>
+            <w:hideMark/>
+          </w:tcPr>
+          <w:p>
+            <w:pPr>
+              <w:spacing w:after="0" w:line="276" w:lineRule="auto"/>
+              <w:jc w:val="center"/>
+              <w:rPr>
+                <w:rFonts w:ascii="Times New Roman" w:eastAsia="Calibri" w:hAnsi="Times New Roman" w:cs="Times New Roman"/>
+                <w:i/>
+                <w:kern w:val="2"/>
+                <w:sz w:val="18"/>
+                <w:szCs w:val="18"/>
+                <w14:ligatures w14:val="standardContextual"/>
+              </w:rPr>
+            </w:pPr>
+            <w:r>
+              <w:rPr>
+                <w:rFonts w:ascii="Times New Roman" w:eastAsia="Calibri" w:hAnsi="Times New Roman" w:cs="Times New Roman"/>
+                <w:i/>
+                <w:kern w:val="2"/>
+                <w:sz w:val="18"/>
+                <w:szCs w:val="18"/>
+                <w14:ligatures w14:val="standardContextual"/>
+              </w:rPr>
+              <w:t>(подпись)</w:t>
+            </w:r>
+          </w:p>
+        </w:tc>
+        <w:tc>
+          <w:tcPr>
+            <w:tcW w:w="150" w:type="pct"/>
+          </w:tcPr>
+          <w:p>
+            <w:pPr>
+              <w:spacing w:after="0" w:line="276" w:lineRule="auto"/>
+              <w:jc w:val="center"/>
+              <w:rPr>
+                <w:rFonts w:ascii="Times New Roman" w:eastAsia="Calibri" w:hAnsi="Times New Roman" w:cs="Times New Roman"/>
+                <w:i/>
+                <w:kern w:val="2"/>
+                <w:sz w:val="18"/>
+                <w:szCs w:val="18"/>
+                <w14:ligatures w14:val="standardContextual"/>
+              </w:rPr>
+            </w:pPr>
+          </w:p>
+        </w:tc>
+        <w:tc>
+          <w:tcPr>
+            <w:tcW w:w="1590" w:type="pct"/>
+            <w:hideMark/>
+          </w:tcPr>
+          <w:p>
+            <w:r>
+              <w:rPr>
+                <w:rFonts w:ascii="Times New Roman" w:hAnsi="Times New Roman"/>
+              </w:rPr>
+              <w:t>Галанов А.В.</w:t>
+            </w:r>
+          </w:p>
+        </w:tc>
+      </w:tr>
+      <w:tr>
+        <w:tc>
+          <w:tcPr>
+            <w:tcW w:w="822" w:type="pct"/>
+          </w:tcPr>
+          <w:p>
+            <w:pPr>
+              <w:spacing w:after="0" w:line="276" w:lineRule="auto"/>
+              <w:rPr>
+                <w:rFonts w:ascii="Times New Roman" w:eastAsia="Calibri" w:hAnsi="Times New Roman" w:cs="Times New Roman"/>
+                <w:kern w:val="2"/>
+                <w:sz w:val="20"/>
+                <w:szCs w:val="20"/>
+                <w14:ligatures w14:val="standardContextual"/>
+              </w:rPr>
+            </w:pPr>
+          </w:p>
+        </w:tc>
+        <w:tc>
+          <w:tcPr>
+            <w:tcW w:w="127" w:type="pct"/>
+          </w:tcPr>
+          <w:p>
+            <w:pPr>
+              <w:spacing w:after="0" w:line="276" w:lineRule="auto"/>
+              <w:jc w:val="center"/>
+              <w:rPr>
+                <w:rFonts w:ascii="Times New Roman" w:eastAsia="Calibri" w:hAnsi="Times New Roman" w:cs="Times New Roman"/>
+                <w:i/>
+                <w:kern w:val="2"/>
+                <w:sz w:val="18"/>
+                <w:szCs w:val="18"/>
+                <w14:ligatures w14:val="standardContextual"/>
+              </w:rPr>
+            </w:pPr>
+          </w:p>
+        </w:tc>
+        <w:tc>
+          <w:tcPr>
+            <w:tcW w:w="1253" w:type="pct"/>
+          </w:tcPr>
+          <w:p>
+            <w:pPr>
+              <w:spacing w:after="0" w:line="276" w:lineRule="auto"/>
+              <w:jc w:val="center"/>
+              <w:rPr>
+                <w:rFonts w:ascii="Times New Roman" w:eastAsia="Calibri" w:hAnsi="Times New Roman" w:cs="Times New Roman"/>
+                <w:i/>
+                <w:kern w:val="2"/>
+                <w:sz w:val="18"/>
+                <w:szCs w:val="18"/>
+                <w14:ligatures w14:val="standardContextual"/>
+              </w:rPr>
+            </w:pPr>
+          </w:p>
+        </w:tc>
+        <w:tc>
+          <w:tcPr>
+            <w:tcW w:w="151" w:type="pct"/>
+          </w:tcPr>
+          <w:p>
+            <w:pPr>
+              <w:spacing w:after="0" w:line="276" w:lineRule="auto"/>
+              <w:jc w:val="center"/>
+              <w:rPr>
+                <w:rFonts w:ascii="Times New Roman" w:eastAsia="Calibri" w:hAnsi="Times New Roman" w:cs="Times New Roman"/>
+                <w:i/>
+                <w:kern w:val="2"/>
+                <w:sz w:val="18"/>
+                <w:szCs w:val="18"/>
+                <w14:ligatures w14:val="standardContextual"/>
+              </w:rPr>
+            </w:pPr>
+          </w:p>
+        </w:tc>
+        <w:tc>
+          <w:tcPr>
+            <w:tcW w:w="907" w:type="pct"/>
+          </w:tcPr>
+          <w:p>
+            <w:pPr>
+              <w:spacing w:after="0" w:line="276" w:lineRule="auto"/>
+              <w:jc w:val="center"/>
+              <w:rPr>
+                <w:rFonts w:ascii="Times New Roman" w:eastAsia="Calibri" w:hAnsi="Times New Roman" w:cs="Times New Roman"/>
+                <w:i/>
+                <w:kern w:val="2"/>
+                <w:sz w:val="18"/>
+                <w:szCs w:val="18"/>
+                <w14:ligatures w14:val="standardContextual"/>
+              </w:rPr>
+            </w:pPr>
+          </w:p>
+        </w:tc>
+        <w:tc>
+          <w:tcPr>
+            <w:tcW w:w="150" w:type="pct"/>
+          </w:tcPr>
+          <w:p>
+            <w:pPr>
+              <w:spacing w:after="0" w:line="276" w:lineRule="auto"/>
+              <w:jc w:val="center"/>
+              <w:rPr>
+                <w:rFonts w:ascii="Times New Roman" w:eastAsia="Calibri" w:hAnsi="Times New Roman" w:cs="Times New Roman"/>
+                <w:i/>
+                <w:kern w:val="2"/>
+                <w:sz w:val="18"/>
+                <w:szCs w:val="18"/>
+                <w14:ligatures w14:val="standardContextual"/>
+              </w:rPr>
+            </w:pPr>
+          </w:p>
+        </w:tc>
+        <w:tc>
+          <w:tcPr>
+            <w:tcW w:w="1590" w:type="pct"/>
+          </w:tcPr>
+          <w:p>
+            <w:pPr>
+              <w:spacing w:after="0" w:line="276" w:lineRule="auto"/>
+              <w:jc w:val="center"/>
+              <w:rPr>
+                <w:rFonts w:ascii="Times New Roman" w:eastAsia="Calibri" w:hAnsi="Times New Roman" w:cs="Times New Roman"/>
+                <w:i/>
+                <w:kern w:val="2"/>
+                <w:sz w:val="18"/>
+                <w:szCs w:val="18"/>
+                <w14:ligatures w14:val="standardContextual"/>
+              </w:rPr>
+            </w:pPr>
+          </w:p>
+        </w:tc>
+      </w:tr>
+      <w:tr>
+        <w:tc>
+          <w:tcPr>
+            <w:tcW w:w="822" w:type="pct"/>
+            <w:vAlign w:val="bottom"/>
+            <w:hideMark/>
+          </w:tcPr>
+          <w:p>
+            <w:pPr>
+              <w:spacing w:after="0" w:line="276" w:lineRule="auto"/>
+              <w:rPr>
+                <w:rFonts w:ascii="Times New Roman" w:eastAsia="Calibri" w:hAnsi="Times New Roman" w:cs="Times New Roman"/>
+                <w:kern w:val="2"/>
+                <w:sz w:val="28"/>
+                <w:szCs w:val="20"/>
+                <w14:ligatures w14:val="standardContextual"/>
+              </w:rPr>
+            </w:pPr>
+            <w:r>
+              <w:rPr>
+                <w:rFonts w:ascii="Times New Roman" w:eastAsia="Calibri" w:hAnsi="Times New Roman" w:cs="Times New Roman"/>
+                <w:kern w:val="2"/>
+                <w:sz w:val="28"/>
+                <w14:ligatures w14:val="standardContextual"/>
+              </w:rPr>
+              <w:t>Принял:</w:t>
+            </w:r>
+          </w:p>
+        </w:tc>
+        <w:tc>
+          <w:tcPr>
+            <w:tcW w:w="127" w:type="pct"/>
+            <w:vAlign w:val="bottom"/>
+          </w:tcPr>
+          <w:p>
+            <w:pPr>
+              <w:spacing w:after="0" w:line="276" w:lineRule="auto"/>
+              <w:jc w:val="center"/>
+              <w:rPr>
+                <w:rFonts w:ascii="Times New Roman" w:eastAsia="Calibri" w:hAnsi="Times New Roman" w:cs="Times New Roman"/>
+                <w:kern w:val="2"/>
+                <w:sz w:val="28"/>
+                <w14:ligatures w14:val="standardContextual"/>
+              </w:rPr>
+            </w:pPr>
+          </w:p>
+        </w:tc>
+        <w:tc>
+          <w:tcPr>
+            <w:tcW w:w="1253" w:type="pct"/>
+            <w:vAlign w:val="bottom"/>
+            <w:hideMark/>
+          </w:tcPr>
+          <w:p>
+            <w:pPr>
+              <w:spacing w:after="0" w:line="276" w:lineRule="auto"/>
+              <w:jc w:val="center"/>
+              <w:rPr>
+                <w:rFonts w:ascii="Times New Roman" w:eastAsia="Calibri" w:hAnsi="Times New Roman" w:cs="Times New Roman"/>
+                <w:kern w:val="2"/>
+                <w:sz w:val="28"/>
+                <w14:ligatures w14:val="standardContextual"/>
+              </w:rPr>
+            </w:pPr>
+            <w:r>
+              <w:rPr>
+                <w:rFonts w:ascii="Times New Roman" w:eastAsia="Calibri" w:hAnsi="Times New Roman" w:cs="Times New Roman"/>
+                <w:kern w:val="2"/>
+                <w:sz w:val="28"/>
+                <w14:ligatures w14:val="standardContextual"/>
+              </w:rPr>
+              <w:t>ст. преп.</w:t>
+            </w:r>
+          </w:p>
+        </w:tc>
+        <w:tc>
+          <w:tcPr>
+            <w:tcW w:w="151" w:type="pct"/>
+            <w:vAlign w:val="bottom"/>
+          </w:tcPr>
+          <w:p>
+            <w:pPr>
+              <w:spacing w:after="0" w:line="276" w:lineRule="auto"/>
+              <w:jc w:val="center"/>
+              <w:rPr>
+                <w:rFonts w:ascii="Times New Roman" w:eastAsia="Calibri" w:hAnsi="Times New Roman" w:cs="Times New Roman"/>
+                <w:kern w:val="2"/>
+                <w:sz w:val="28"/>
+                <w14:ligatures w14:val="standardContextual"/>
+              </w:rPr>
+            </w:pPr>
+          </w:p>
+        </w:tc>
+        <w:tc>
+          <w:tcPr>
+            <w:tcW w:w="907" w:type="pct"/>
+            <w:vAlign w:val="bottom"/>
+          </w:tcPr>
+          <w:p>
+            <w:pPr>
+              <w:spacing w:after="0" w:line="276" w:lineRule="auto"/>
+              <w:jc w:val="center"/>
+              <w:rPr>
+                <w:rFonts w:ascii="Times New Roman" w:eastAsia="Calibri" w:hAnsi="Times New Roman" w:cs="Times New Roman"/>
+                <w:kern w:val="2"/>
+                <w:sz w:val="28"/>
+                <w14:ligatures w14:val="standardContextual"/>
+              </w:rPr>
+            </w:pPr>
+          </w:p>
+        </w:tc>
+        <w:tc>
+          <w:tcPr>
+            <w:tcW w:w="150" w:type="pct"/>
+            <w:vAlign w:val="bottom"/>
+          </w:tcPr>
+          <w:p>
+            <w:pPr>
+              <w:spacing w:after="0" w:line="276" w:lineRule="auto"/>
+              <w:jc w:val="center"/>
+              <w:rPr>
+                <w:rFonts w:ascii="Times New Roman" w:eastAsia="Calibri" w:hAnsi="Times New Roman" w:cs="Times New Roman"/>
+                <w:kern w:val="2"/>
+                <w:sz w:val="28"/>
+                <w14:ligatures w14:val="standardContextual"/>
+              </w:rPr>
+            </w:pPr>
+          </w:p>
+        </w:tc>
+        <w:tc>
+          <w:tcPr>
+            <w:tcW w:w="1590" w:type="pct"/>
+            <w:vAlign w:val="bottom"/>
+            <w:hideMark/>
+          </w:tcPr>
+          <w:p>
+            <w:pPr>
+              <w:spacing w:after="0" w:line="276" w:lineRule="auto"/>
+              <w:jc w:val="center"/>
+              <w:rPr>
+                <w:rFonts w:ascii="Times New Roman" w:eastAsia="Calibri" w:hAnsi="Times New Roman" w:cs="Times New Roman"/>
+                <w:kern w:val="2"/>
+                <w:sz w:val="28"/>
+                <w14:ligatures w14:val="standardContextual"/>
+              </w:rPr>
+            </w:pPr>
+            <w:r>
+              <w:rPr>
+                <w:rFonts w:ascii="Times New Roman" w:eastAsia="Calibri" w:hAnsi="Times New Roman" w:cs="Times New Roman"/>
+                <w:kern w:val="2"/>
+                <w:sz w:val="28"/>
+                <w14:ligatures w14:val="standardContextual"/>
+              </w:rPr>
+              <w:t>Гиматдинов Д</w:t>
+            </w:r>
+            <w:r>
+              <w:rPr>
+                <w:rFonts w:ascii="Times New Roman" w:eastAsia="Calibri" w:hAnsi="Times New Roman" w:cs="Times New Roman"/>
+                <w:kern w:val="2"/>
+                <w:sz w:val="28"/>
+                <w14:ligatures w14:val="standardContextual"/>
+              </w:rPr>
+              <w:t>.</w:t>
+            </w:r>
+            <w:r>
+              <w:rPr>
+                <w:rFonts w:ascii="Times New Roman" w:eastAsia="Calibri" w:hAnsi="Times New Roman" w:cs="Times New Roman"/>
+                <w:kern w:val="2"/>
+                <w:sz w:val="28"/>
+                <w14:ligatures w14:val="standardContextual"/>
+              </w:rPr>
+              <w:t>М.</w:t>
+            </w:r>
+          </w:p>
+        </w:tc>
+      </w:tr>
+      <w:tr>
+        <w:tc>
+          <w:tcPr>
+            <w:tcW w:w="822" w:type="pct"/>
+          </w:tcPr>
+          <w:p>
+            <w:pPr>
+              <w:spacing w:after="0" w:line="276" w:lineRule="auto"/>
+              <w:rPr>
+                <w:rFonts w:ascii="Times New Roman" w:eastAsia="Calibri" w:hAnsi="Times New Roman" w:cs="Times New Roman"/>
+                <w:kern w:val="2"/>
+                <w:sz w:val="20"/>
+                <w:szCs w:val="20"/>
+                <w14:ligatures w14:val="standardContextual"/>
+              </w:rPr>
+            </w:pPr>
+          </w:p>
+        </w:tc>
+        <w:tc>
+          <w:tcPr>
+            <w:tcW w:w="127" w:type="pct"/>
+          </w:tcPr>
+          <w:p>
+            <w:pPr>
+              <w:spacing w:after="0" w:line="276" w:lineRule="auto"/>
+              <w:jc w:val="center"/>
+              <w:rPr>
+                <w:rFonts w:ascii="Times New Roman" w:eastAsia="Calibri" w:hAnsi="Times New Roman" w:cs="Times New Roman"/>
+                <w:i/>
+                <w:kern w:val="2"/>
+                <w:sz w:val="18"/>
+                <w:szCs w:val="18"/>
+                <w14:ligatures w14:val="standardContextual"/>
+              </w:rPr>
+            </w:pPr>
+          </w:p>
+        </w:tc>
+        <w:tc>
+          <w:tcPr>
+            <w:tcW w:w="1253" w:type="pct"/>
+            <w:hideMark/>
+          </w:tcPr>
+          <w:p>
+            <w:pPr>
+              <w:spacing w:after="0" w:line="276" w:lineRule="auto"/>
+              <w:jc w:val="center"/>
+              <w:rPr>
+                <w:rFonts w:ascii="Times New Roman" w:eastAsia="Calibri" w:hAnsi="Times New Roman" w:cs="Times New Roman"/>
+                <w:i/>
+                <w:kern w:val="2"/>
+                <w:sz w:val="18"/>
+                <w:szCs w:val="18"/>
+                <w14:ligatures w14:val="standardContextual"/>
+              </w:rPr>
+            </w:pPr>
+            <w:r>
+              <w:rPr>
+                <w:rFonts w:ascii="Times New Roman" w:eastAsia="Calibri" w:hAnsi="Times New Roman" w:cs="Times New Roman"/>
+                <w:i/>
+                <w:kern w:val="2"/>
+                <w:sz w:val="18"/>
+                <w:szCs w:val="18"/>
+                <w14:ligatures w14:val="standardContextual"/>
+              </w:rPr>
+              <w:t>(должность)</w:t>
+            </w:r>
+          </w:p>
+        </w:tc>
+        <w:tc>
+          <w:tcPr>
+            <w:tcW w:w="151" w:type="pct"/>
+          </w:tcPr>
+          <w:p>
+            <w:pPr>
+              <w:spacing w:after="0" w:line="276" w:lineRule="auto"/>
+              <w:jc w:val="center"/>
+              <w:rPr>
+                <w:rFonts w:ascii="Times New Roman" w:eastAsia="Calibri" w:hAnsi="Times New Roman" w:cs="Times New Roman"/>
+                <w:i/>
+                <w:kern w:val="2"/>
+                <w:sz w:val="18"/>
+                <w:szCs w:val="18"/>
+                <w14:ligatures w14:val="standardContextual"/>
+              </w:rPr>
+            </w:pPr>
+          </w:p>
+        </w:tc>
+        <w:tc>
+          <w:tcPr>
+            <w:tcW w:w="907" w:type="pct"/>
+            <w:hideMark/>
+          </w:tcPr>
+          <w:p>
+            <w:pPr>
+              <w:spacing w:after="0" w:line="276" w:lineRule="auto"/>
+              <w:jc w:val="center"/>
+              <w:rPr>
+                <w:rFonts w:ascii="Times New Roman" w:eastAsia="Calibri" w:hAnsi="Times New Roman" w:cs="Times New Roman"/>
+                <w:i/>
+                <w:kern w:val="2"/>
+                <w:sz w:val="18"/>
+                <w:szCs w:val="18"/>
+                <w14:ligatures w14:val="standardContextual"/>
+              </w:rPr>
+            </w:pPr>
+            <w:r>
+              <w:rPr>
+                <w:rFonts w:ascii="Times New Roman" w:eastAsia="Calibri" w:hAnsi="Times New Roman" w:cs="Times New Roman"/>
+                <w:i/>
+                <w:kern w:val="2"/>
+                <w:sz w:val="18"/>
+                <w:szCs w:val="18"/>
+                <w14:ligatures w14:val="standardContextual"/>
+              </w:rPr>
+              <w:t>(подпись)</w:t>
+            </w:r>
+          </w:p>
+        </w:tc>
+        <w:tc>
+          <w:tcPr>
+            <w:tcW w:w="150" w:type="pct"/>
+          </w:tcPr>
+          <w:p>
+            <w:pPr>
+              <w:spacing w:after="0" w:line="276" w:lineRule="auto"/>
+              <w:jc w:val="center"/>
+              <w:rPr>
+                <w:rFonts w:ascii="Times New Roman" w:eastAsia="Calibri" w:hAnsi="Times New Roman" w:cs="Times New Roman"/>
+                <w:i/>
+                <w:kern w:val="2"/>
+                <w:sz w:val="18"/>
+                <w:szCs w:val="18"/>
+                <w14:ligatures w14:val="standardContextual"/>
+              </w:rPr>
+            </w:pPr>
+          </w:p>
+        </w:tc>
+        <w:tc>
+          <w:tcPr>
+            <w:tcW w:w="1590" w:type="pct"/>
+            <w:hideMark/>
+          </w:tcPr>
+          <w:p>
+            <w:r>
+              <w:rPr>
+                <w:rFonts w:ascii="Times New Roman" w:hAnsi="Times New Roman"/>
+              </w:rPr>
+              <w:t>Галанов А.В.</w:t>
+            </w:r>
+          </w:p>
+        </w:tc>
+      </w:tr>
+      <w:tr>
+        <w:trPr>
+          <w:trHeight w:val="709"/>
+        </w:trPr>
+        <w:tc>
+          <w:tcPr>
+            <w:tcW w:w="822" w:type="pct"/>
+          </w:tcPr>
+          <w:p>
+            <w:pPr>
+              <w:spacing w:after="0" w:line="276" w:lineRule="auto"/>
+              <w:rPr>
+                <w:rFonts w:ascii="Times New Roman" w:eastAsia="Calibri" w:hAnsi="Times New Roman" w:cs="Times New Roman"/>
+                <w:kern w:val="2"/>
+                <w:sz w:val="20"/>
+                <w:szCs w:val="20"/>
+                <w14:ligatures w14:val="standardContextual"/>
+              </w:rPr>
+            </w:pPr>
+          </w:p>
+        </w:tc>
+        <w:tc>
+          <w:tcPr>
+            <w:tcW w:w="127" w:type="pct"/>
+          </w:tcPr>
+          <w:p>
+            <w:pPr>
+              <w:spacing w:after="0" w:line="276" w:lineRule="auto"/>
+              <w:jc w:val="center"/>
+              <w:rPr>
+                <w:rFonts w:ascii="Times New Roman" w:eastAsia="Calibri" w:hAnsi="Times New Roman" w:cs="Times New Roman"/>
+                <w:i/>
+                <w:kern w:val="2"/>
+                <w:sz w:val="18"/>
+                <w:szCs w:val="18"/>
+                <w14:ligatures w14:val="standardContextual"/>
+              </w:rPr>
+            </w:pPr>
+          </w:p>
+        </w:tc>
+        <w:tc>
+          <w:tcPr>
+            <w:tcW w:w="1253" w:type="pct"/>
+          </w:tcPr>
+          <w:p>
+            <w:pPr>
+              <w:spacing w:after="0" w:line="276" w:lineRule="auto"/>
+              <w:jc w:val="center"/>
+              <w:rPr>
+                <w:rFonts w:ascii="Times New Roman" w:eastAsia="Calibri" w:hAnsi="Times New Roman" w:cs="Times New Roman"/>
+                <w:i/>
+                <w:kern w:val="2"/>
+                <w:sz w:val="18"/>
+                <w:szCs w:val="18"/>
+                <w14:ligatures w14:val="standardContextual"/>
+              </w:rPr>
+            </w:pPr>
+          </w:p>
+        </w:tc>
+        <w:tc>
+          <w:tcPr>
+            <w:tcW w:w="151" w:type="pct"/>
+          </w:tcPr>
+          <w:p>
+            <w:pPr>
+              <w:spacing w:after="0" w:line="276" w:lineRule="auto"/>
+              <w:jc w:val="center"/>
+              <w:rPr>
+                <w:rFonts w:ascii="Times New Roman" w:eastAsia="Calibri" w:hAnsi="Times New Roman" w:cs="Times New Roman"/>
+                <w:i/>
+                <w:kern w:val="2"/>
+                <w:sz w:val="18"/>
+                <w:szCs w:val="18"/>
+                <w14:ligatures w14:val="standardContextual"/>
+              </w:rPr>
+            </w:pPr>
+          </w:p>
+        </w:tc>
+        <w:tc>
+          <w:tcPr>
+            <w:tcW w:w="907" w:type="pct"/>
+          </w:tcPr>
+          <w:p>
+            <w:pPr>
+              <w:spacing w:after="0" w:line="276" w:lineRule="auto"/>
+              <w:jc w:val="center"/>
+              <w:rPr>
+                <w:rFonts w:ascii="Times New Roman" w:eastAsia="Calibri" w:hAnsi="Times New Roman" w:cs="Times New Roman"/>
+                <w:i/>
+                <w:kern w:val="2"/>
+                <w:sz w:val="18"/>
+                <w:szCs w:val="18"/>
+                <w14:ligatures w14:val="standardContextual"/>
+              </w:rPr>
+            </w:pPr>
+          </w:p>
+        </w:tc>
+        <w:tc>
+          <w:tcPr>
+            <w:tcW w:w="150" w:type="pct"/>
+          </w:tcPr>
+          <w:p>
+            <w:pPr>
+              <w:spacing w:after="0" w:line="276" w:lineRule="auto"/>
+              <w:jc w:val="center"/>
+              <w:rPr>
+                <w:rFonts w:ascii="Times New Roman" w:eastAsia="Calibri" w:hAnsi="Times New Roman" w:cs="Times New Roman"/>
+                <w:i/>
+                <w:kern w:val="2"/>
+                <w:sz w:val="18"/>
+                <w:szCs w:val="18"/>
+                <w14:ligatures w14:val="standardContextual"/>
+              </w:rPr>
+            </w:pPr>
+          </w:p>
+        </w:tc>
+        <w:tc>
+          <w:tcPr>
+            <w:tcW w:w="1590" w:type="pct"/>
+          </w:tcPr>
+          <w:p>
+            <w:pPr>
+              <w:spacing w:after="0" w:line="276" w:lineRule="auto"/>
+              <w:jc w:val="center"/>
+              <w:rPr>
+                <w:rFonts w:ascii="Times New Roman" w:eastAsia="Calibri" w:hAnsi="Times New Roman" w:cs="Times New Roman"/>
+                <w:i/>
+                <w:kern w:val="2"/>
+                <w:sz w:val="18"/>
+                <w:szCs w:val="18"/>
+                <w14:ligatures w14:val="standardContextual"/>
+              </w:rPr>
+            </w:pPr>
+          </w:p>
+        </w:tc>
+      </w:tr>
+    </w:tbl>
+    <w:p>
+      <w:pPr>
+        <w:spacing w:after="0" w:line="276" w:lineRule="auto"/>
+        <w:jc w:val="center"/>
+        <w:rPr>
+          <w:rFonts w:ascii="Times New Roman" w:eastAsia="Calibri" w:hAnsi="Times New Roman" w:cs="Times New Roman"/>
+          <w:sz w:val="28"/>
+        </w:rPr>
+      </w:pPr>
+    </w:p>
+    <w:p>
+      <w:pPr>
+        <w:spacing w:after="0" w:line="276" w:lineRule="auto"/>
+        <w:jc w:val="center"/>
+        <w:rPr>
+          <w:rFonts w:ascii="Times New Roman" w:eastAsia="Calibri" w:hAnsi="Times New Roman" w:cs="Times New Roman"/>
+          <w:sz w:val="28"/>
+        </w:rPr>
+      </w:pPr>
+    </w:p>
+    <w:p>
+      <w:pPr>
+        <w:spacing w:after="0" w:line="276" w:lineRule="auto"/>
+        <w:jc w:val="center"/>
+        <w:rPr>
+          <w:rFonts w:ascii="Times New Roman" w:eastAsia="Calibri" w:hAnsi="Times New Roman" w:cs="Times New Roman"/>
+          <w:sz w:val="28"/>
+        </w:rPr>
+      </w:pPr>
+    </w:p>
+    <w:p>
+      <w:pPr>
+        <w:spacing w:after="0" w:line="276" w:lineRule="auto"/>
+        <w:jc w:val="center"/>
+        <w:rPr>
+          <w:rFonts w:ascii="Times New Roman" w:eastAsia="Calibri" w:hAnsi="Times New Roman" w:cs="Times New Roman"/>
+          <w:sz w:val="28"/>
+        </w:rPr>
+      </w:pPr>
+    </w:p>
+    <w:p>
+      <w:pPr>
+        <w:spacing w:after="0" w:line="276" w:lineRule="auto"/>
+        <w:jc w:val="center"/>
+        <w:rPr>
+          <w:rFonts w:ascii="Times New Roman" w:eastAsia="Calibri" w:hAnsi="Times New Roman" w:cs="Times New Roman"/>
+          <w:sz w:val="28"/>
+        </w:rPr>
+      </w:pPr>
+    </w:p>
+    <w:p>
+      <w:pPr>
+        <w:spacing w:after="0" w:line="276" w:lineRule="auto"/>
+        <w:jc w:val="center"/>
+        <w:rPr>
+          <w:rFonts w:ascii="Times New Roman" w:eastAsia="Calibri" w:hAnsi="Times New Roman" w:cs="Times New Roman"/>
+          <w:sz w:val="28"/>
+        </w:rPr>
       </w:pPr>
       <w:r>
-        <w:t>Выполнил: Галанов Андрей</w:t>
-        <w:br/>
-        <w:t>Группа: ЭФБО-03-24</w:t>
+        <w:rPr>
+          <w:rFonts w:ascii="Times New Roman" w:eastAsia="Calibri" w:hAnsi="Times New Roman" w:cs="Times New Roman"/>
+          <w:sz w:val="28"/>
+        </w:rPr>
+        <w:t>Москва</w:t>
       </w:r>
     </w:p>
-    <w:p/>
-    <w:p/>
-    <w:p/>
-    <w:p/>
     <w:p>
       <w:pPr>
+        <w:spacing w:after="0" w:line="276" w:lineRule="auto"/>
         <w:jc w:val="center"/>
+        <w:rPr>
+          <w:rFonts w:ascii="Times New Roman" w:eastAsia="Calibri" w:hAnsi="Times New Roman" w:cs="Times New Roman"/>
+          <w:sz w:val="28"/>
+          <w:szCs w:val="28"/>
+        </w:rPr>
       </w:pPr>
       <w:r>
-        <w:t>Москва 2026</w:t>
+        <w:rPr>
+          <w:rFonts w:ascii="Times New Roman" w:eastAsia="Calibri" w:hAnsi="Times New Roman" w:cs="Times New Roman"/>
+          <w:sz w:val="28"/>
+        </w:rPr>
+        <w:t>202</w:t>
+      </w:r>
+      <w:r>
+        <w:rPr>
+          <w:rFonts w:ascii="Times New Roman" w:eastAsia="Calibri" w:hAnsi="Times New Roman" w:cs="Times New Roman"/>
+          <w:sz w:val="28"/>
+        </w:rPr>
+        <w:t>6</w:t>
       </w:r>
     </w:p>
     <w:p>
       <w:r>
-        <w:br w:type="page"/>
+        <w:br/>
       </w:r>
     </w:p>
     <w:p>

</xml_diff>

<commit_message>
docs: fix title pages for practical reports 5-7
</commit_message>
<xml_diff>
--- a/Отчёты/Практическая работа №5.docx
+++ b/Отчёты/Практическая работа №5.docx
@@ -57,7 +57,7 @@
                           </pic:cNvPicPr>
                         </pic:nvPicPr>
                         <pic:blipFill>
-                          <a:blip r:embed="rId6"/>
+                          <a:blip r:embed="rId16"/>
                           <a:stretch/>
                         </pic:blipFill>
                         <pic:spPr bwMode="auto">
@@ -543,37 +543,11 @@
             <w:hideMark/>
           </w:tcPr>
           <w:p>
-            <w:pPr>
-              <w:spacing w:after="0" w:line="276" w:lineRule="auto"/>
-              <w:jc w:val="center"/>
-              <w:rPr>
-                <w:rFonts w:ascii="Times New Roman" w:eastAsia="Calibri" w:hAnsi="Times New Roman" w:cs="Times New Roman"/>
-                <w:kern w:val="2"/>
-                <w:sz w:val="28"/>
-                <w14:ligatures w14:val="standardContextual"/>
-              </w:rPr>
-            </w:pPr>
             <w:r>
-              <w:rPr>
-                <w:rFonts w:ascii="Times New Roman" w:eastAsia="Calibri" w:hAnsi="Times New Roman" w:cs="Times New Roman"/>
-                <w:kern w:val="2"/>
-                <w:sz w:val="28"/>
-                <w14:ligatures w14:val="standardContextual"/>
-              </w:rPr>
               <w:t>студент группы</w:t>
+              <w:br/>
+              <w:t>ЭФБО-03-24</w:t>
             </w:r>
-          </w:p>
-          <w:p>
-            <w:pPr>
-              <w:spacing w:after="0" w:line="276" w:lineRule="auto"/>
-              <w:jc w:val="center"/>
-              <w:rPr>
-                <w:rFonts w:ascii="Times New Roman" w:eastAsia="Calibri" w:hAnsi="Times New Roman" w:cs="Times New Roman"/>
-                <w:kern w:val="2"/>
-                <w:sz w:val="28"/>
-                <w14:ligatures w14:val="standardContextual"/>
-              </w:rPr>
-            </w:pPr>
           </w:p>
         </w:tc>
         <w:tc>
@@ -637,16 +611,9 @@
             <w:hideMark/>
           </w:tcPr>
           <w:p>
-            <w:pPr>
-              <w:spacing w:after="0" w:line="276" w:lineRule="auto"/>
-              <w:jc w:val="center"/>
-              <w:rPr>
-                <w:rFonts w:ascii="Times New Roman" w:eastAsia="Calibri" w:hAnsi="Times New Roman" w:cs="Times New Roman"/>
-                <w:kern w:val="2"/>
-                <w:sz w:val="28"/>
-                <w14:ligatures w14:val="standardContextual"/>
-              </w:rPr>
-            </w:pPr>
+            <w:r>
+              <w:t>Галанов А.В.</w:t>
+            </w:r>
           </w:p>
         </w:tc>
       </w:tr>
@@ -693,11 +660,28 @@
             <w:hideMark/>
           </w:tcPr>
           <w:p>
+            <w:pPr>
+              <w:spacing w:after="0" w:line="276" w:lineRule="auto"/>
+              <w:jc w:val="center"/>
+              <w:rPr>
+                <w:rFonts w:ascii="Times New Roman" w:eastAsia="Calibri" w:hAnsi="Times New Roman" w:cs="Times New Roman"/>
+                <w:i/>
+                <w:kern w:val="2"/>
+                <w:sz w:val="18"/>
+                <w:szCs w:val="18"/>
+                <w14:ligatures w14:val="standardContextual"/>
+              </w:rPr>
+            </w:pPr>
             <w:r>
               <w:rPr>
-                <w:rFonts w:ascii="Times New Roman" w:hAnsi="Times New Roman"/>
+                <w:rFonts w:ascii="Times New Roman" w:eastAsia="Calibri" w:hAnsi="Times New Roman" w:cs="Times New Roman"/>
+                <w:i/>
+                <w:kern w:val="2"/>
+                <w:sz w:val="18"/>
+                <w:szCs w:val="18"/>
+                <w14:ligatures w14:val="standardContextual"/>
               </w:rPr>
-              <w:t>ЭФБО-03-24</w:t>
+              <w:t>(группа)</w:t>
             </w:r>
           </w:p>
         </w:tc>
@@ -776,11 +760,28 @@
             <w:hideMark/>
           </w:tcPr>
           <w:p>
+            <w:pPr>
+              <w:spacing w:after="0" w:line="276" w:lineRule="auto"/>
+              <w:jc w:val="center"/>
+              <w:rPr>
+                <w:rFonts w:ascii="Times New Roman" w:eastAsia="Calibri" w:hAnsi="Times New Roman" w:cs="Times New Roman"/>
+                <w:i/>
+                <w:kern w:val="2"/>
+                <w:sz w:val="18"/>
+                <w:szCs w:val="18"/>
+                <w14:ligatures w14:val="standardContextual"/>
+              </w:rPr>
+            </w:pPr>
             <w:r>
               <w:rPr>
-                <w:rFonts w:ascii="Times New Roman" w:hAnsi="Times New Roman"/>
+                <w:rFonts w:ascii="Times New Roman" w:eastAsia="Calibri" w:hAnsi="Times New Roman" w:cs="Times New Roman"/>
+                <w:i/>
+                <w:kern w:val="2"/>
+                <w:sz w:val="18"/>
+                <w:szCs w:val="18"/>
+                <w14:ligatures w14:val="standardContextual"/>
               </w:rPr>
-              <w:t>Галанов А.В.</w:t>
+              <w:t>(Фамилия И.О.)</w:t>
             </w:r>
           </w:p>
         </w:tc>
@@ -1237,11 +1238,28 @@
             <w:hideMark/>
           </w:tcPr>
           <w:p>
+            <w:pPr>
+              <w:spacing w:after="0" w:line="276" w:lineRule="auto"/>
+              <w:jc w:val="center"/>
+              <w:rPr>
+                <w:rFonts w:ascii="Times New Roman" w:eastAsia="Calibri" w:hAnsi="Times New Roman" w:cs="Times New Roman"/>
+                <w:i/>
+                <w:kern w:val="2"/>
+                <w:sz w:val="18"/>
+                <w:szCs w:val="18"/>
+                <w14:ligatures w14:val="standardContextual"/>
+              </w:rPr>
+            </w:pPr>
             <w:r>
               <w:rPr>
-                <w:rFonts w:ascii="Times New Roman" w:hAnsi="Times New Roman"/>
+                <w:rFonts w:ascii="Times New Roman" w:eastAsia="Calibri" w:hAnsi="Times New Roman" w:cs="Times New Roman"/>
+                <w:i/>
+                <w:kern w:val="2"/>
+                <w:sz w:val="18"/>
+                <w:szCs w:val="18"/>
+                <w14:ligatures w14:val="standardContextual"/>
               </w:rPr>
-              <w:t>Галанов А.В.</w:t>
+              <w:t>(Фамилия И.О.)</w:t>
             </w:r>
           </w:p>
         </w:tc>
@@ -1476,13 +1494,9 @@
       </w:r>
     </w:p>
     <w:p>
-      <w:r>
-        <w:br/>
-      </w:r>
-    </w:p>
-    <w:p>
       <w:pPr>
         <w:pStyle w:val="Heading1"/>
+        <w:pageBreakBefore/>
       </w:pPr>
       <w:r>
         <w:t>1 Цель и подготовка сервера</w:t>

</xml_diff>

<commit_message>
docs: complete PR5 verification report
</commit_message>
<xml_diff>
--- a/Отчёты/Практическая работа №5.docx
+++ b/Отчёты/Практическая работа №5.docx
@@ -2258,6 +2258,121 @@
         <w:t>Репозиторий: https://github.com/FireFly4ik/devops-course-2026</w:t>
       </w:r>
     </w:p>
+    <w:p>
+      <w:pPr>
+        <w:pStyle w:val="Heading1"/>
+        <w:pageBreakBefore/>
+      </w:pPr>
+      <w:r>
+        <w:t>Дополнительная проверка и актуализация инструкции</w:t>
+      </w:r>
+    </w:p>
+    <w:p>
+      <w:r>
+        <w:t>Сравнение методов аутентификации выполнено повторно в изолированном опыте внутри VM. Отдельный sshd слушал только 127.0.0.1:2223 с PasswordAuthentication yes и не был доступен с Mac. Это воспроизведение исходной конфигурации, а не сохранённый замер первого подключения. Рабочий SSH на 2222 не изменялся.</w:t>
+      </w:r>
+    </w:p>
+    <w:p>
+      <w:pPr>
+        <w:pStyle w:val="Commands"/>
+        <w:keepLines/>
+        <w:spacing w:after="100"/>
+      </w:pPr>
+      <w:r>
+        <w:t>$ ssh -vv -o 'BatchMode yes' -o 'StrictHostKeyChecking no' \</w:t>
+        <w:br/>
+        <w:t xml:space="preserve">  -o 'UserKnownHostsFile /dev/null' -p 2223 student@127.0.0.1 true \</w:t>
+        <w:br/>
+        <w:t xml:space="preserve">  2&gt;&amp;1 | grep 'Authentications that can continue'</w:t>
+        <w:br/>
+        <w:t>debug1: Authentications that can continue: publickey,password</w:t>
+        <w:br/>
+        <w:t>$ ssh -vv -o 'BatchMode yes' -o 'StrictHostKeyChecking no' \</w:t>
+        <w:br/>
+        <w:t xml:space="preserve">  -o 'UserKnownHostsFile /dev/null' -p 2222 devops@127.0.0.1 true \</w:t>
+        <w:br/>
+        <w:t xml:space="preserve">  2&gt;&amp;1 | grep 'Authentications that can continue'</w:t>
+        <w:br/>
+        <w:t>debug1: Authentications that can continue: publickey</w:t>
+      </w:r>
+    </w:p>
+    <w:p>
+      <w:r>
+        <w:t>Параметры проверки ключа хоста отключены только для одноразового локального теста на loopback; клиентская конфигурация рабочего доступа не изменена. После сравнения тестовый sshd остановлен; ss не выводит слушателя на 2223.</w:t>
+      </w:r>
+    </w:p>
+    <w:p>
+      <w:pPr>
+        <w:keepNext/>
+        <w:jc w:val="center"/>
+      </w:pPr>
+      <w:r>
+        <w:drawing>
+          <wp:inline xmlns:a="http://schemas.openxmlformats.org/drawingml/2006/main" xmlns:pic="http://schemas.openxmlformats.org/drawingml/2006/picture">
+            <wp:extent cx="6120000" cy="1479910"/>
+            <wp:docPr id="1468553569" name="Picture 1468553569"/>
+            <wp:cNvGraphicFramePr>
+              <a:graphicFrameLocks noChangeAspect="1"/>
+            </wp:cNvGraphicFramePr>
+            <a:graphic>
+              <a:graphicData uri="http://schemas.openxmlformats.org/drawingml/2006/picture">
+                <pic:pic>
+                  <pic:nvPicPr>
+                    <pic:cNvPr id="0" name="09-ssh-methods.png"/>
+                    <pic:cNvPicPr/>
+                  </pic:nvPicPr>
+                  <pic:blipFill>
+                    <a:blip r:embed="rId17"/>
+                    <a:srcRect b="61356"/>
+                    <a:stretch>
+                      <a:fillRect/>
+                    </a:stretch>
+                  </pic:blipFill>
+                  <pic:spPr>
+                    <a:xfrm>
+                      <a:off x="0" y="0"/>
+                      <a:ext cx="6120000" cy="1479910"/>
+                    </a:xfrm>
+                    <a:prstGeom prst="rect"/>
+                  </pic:spPr>
+                </pic:pic>
+              </a:graphicData>
+            </a:graphic>
+          </wp:inline>
+        </w:drawing>
+      </w:r>
+    </w:p>
+    <w:p>
+      <w:pPr>
+        <w:pStyle w:val="Caption"/>
+        <w:keepNext w:val="0"/>
+        <w:jc w:val="center"/>
+      </w:pPr>
+      <w:r>
+        <w:t>Повторное сравнение методов и остановка тестового sshd</w:t>
+      </w:r>
+    </w:p>
+    <w:p>
+      <w:r>
+        <w:t>В инструкции восстановления исправлен запуск аудита: после чистого снимка достаточно этапа ssh. Отсутствующие Nginx и Docker не требуются, но ошибки SSH/UFW по-прежнему приводят к ненулевому коду.</w:t>
+      </w:r>
+    </w:p>
+    <w:p>
+      <w:pPr>
+        <w:pStyle w:val="Commands"/>
+        <w:keepLines/>
+        <w:spacing w:after="100"/>
+      </w:pPr>
+      <w:r>
+        <w:t>$ sudo bash /home/devops/audit.sh --stage ssh</w:t>
+        <w:br/>
+        <w:t>Пройдено: 6, не пройдено: 0</w:t>
+        <w:br/>
+        <w:t>$ echo $?</w:t>
+        <w:br/>
+        <w:t>0</w:t>
+      </w:r>
+    </w:p>
     <w:sectPr>
       <w:pgSz w:w="11906" w:h="16838"/>
       <w:pgMar w:top="1020" w:right="1134" w:bottom="1020" w:left="1134" w:header="720" w:footer="720" w:gutter="0"/>

</xml_diff>